<commit_message>
chore(tfl): rebuild combined review outputs
Regenerated via 99_combine_outputs.R so the combined review documents
pick up the corrected T-AE-03/04/05 arm assignments and the T-AE-02
footnote.

Co-Authored-By: Claude Opus 5 (1M context) <noreply@anthropic.com>
</commit_message>
<xml_diff>
--- a/tfl/TFL-OUTPUTS.docx
+++ b/tfl/TFL-OUTPUTS.docx
@@ -1323,7 +1323,7 @@
           <w:szCs w:val="18"/>
           <w:color w:val="C0392B"/>
         </w:rPr>
-        <w:t xml:space="preserve">DRAFT — produced 2026-07-19 — synthetic data, NOT for regulatory submission</w:t>
+        <w:t xml:space="preserve">DRAFT — produced 2026-09-20 — synthetic data, NOT for regulatory submission</w:t>
       </w:r>
     </w:p>
     <w:p>
@@ -1501,7 +1501,7 @@
           <w:szCs w:val="14"/>
           <w:color w:val="C0392B"/>
         </w:rPr>
-        <w:t xml:space="preserve">DRAFT — produced 2026-07-19 — synthetic data, NOT for regulatory submission</w:t>
+        <w:t xml:space="preserve">DRAFT — produced 2026-09-20 — synthetic data, NOT for regulatory submission</w:t>
       </w:r>
     </w:p>
     <w:p>
@@ -1679,7 +1679,7 @@
           <w:szCs w:val="14"/>
           <w:color w:val="C0392B"/>
         </w:rPr>
-        <w:t xml:space="preserve">DRAFT — produced 2026-07-19 — synthetic data, NOT for regulatory submission</w:t>
+        <w:t xml:space="preserve">DRAFT — produced 2026-09-20 — synthetic data, NOT for regulatory submission</w:t>
       </w:r>
     </w:p>
     <w:p>
@@ -1857,7 +1857,7 @@
           <w:szCs w:val="14"/>
           <w:color w:val="C0392B"/>
         </w:rPr>
-        <w:t xml:space="preserve">DRAFT — produced 2026-07-19 — synthetic data, NOT for regulatory submission</w:t>
+        <w:t xml:space="preserve">DRAFT — produced 2026-09-20 — synthetic data, NOT for regulatory submission</w:t>
       </w:r>
     </w:p>
     <w:p>
@@ -2035,7 +2035,7 @@
           <w:szCs w:val="14"/>
           <w:color w:val="C0392B"/>
         </w:rPr>
-        <w:t xml:space="preserve">DRAFT — produced 2026-07-19 — synthetic data, NOT for regulatory submission</w:t>
+        <w:t xml:space="preserve">DRAFT — produced 2026-09-20 — synthetic data, NOT for regulatory submission</w:t>
       </w:r>
     </w:p>
     <w:p>
@@ -2213,7 +2213,7 @@
           <w:szCs w:val="14"/>
           <w:color w:val="C0392B"/>
         </w:rPr>
-        <w:t xml:space="preserve">DRAFT — produced 2026-07-19 — synthetic data, NOT for regulatory submission</w:t>
+        <w:t xml:space="preserve">DRAFT — produced 2026-09-20 — synthetic data, NOT for regulatory submission</w:t>
       </w:r>
     </w:p>
     <w:p>
@@ -2391,7 +2391,7 @@
           <w:szCs w:val="14"/>
           <w:color w:val="C0392B"/>
         </w:rPr>
-        <w:t xml:space="preserve">DRAFT — produced 2026-07-19 — synthetic data, NOT for regulatory submission</w:t>
+        <w:t xml:space="preserve">DRAFT — produced 2026-09-20 — synthetic data, NOT for regulatory submission</w:t>
       </w:r>
     </w:p>
     <w:p>
@@ -2569,7 +2569,7 @@
           <w:szCs w:val="14"/>
           <w:color w:val="C0392B"/>
         </w:rPr>
-        <w:t xml:space="preserve">DRAFT — produced 2026-07-19 — synthetic data, NOT for regulatory submission</w:t>
+        <w:t xml:space="preserve">DRAFT — produced 2026-09-20 — synthetic data, NOT for regulatory submission</w:t>
       </w:r>
     </w:p>
     <w:p>
@@ -2747,7 +2747,7 @@
           <w:szCs w:val="14"/>
           <w:color w:val="C0392B"/>
         </w:rPr>
-        <w:t xml:space="preserve">DRAFT — produced 2026-07-19 — synthetic data, NOT for regulatory submission</w:t>
+        <w:t xml:space="preserve">DRAFT — produced 2026-09-20 — synthetic data, NOT for regulatory submission</w:t>
       </w:r>
     </w:p>
     <w:p>
@@ -2925,7 +2925,7 @@
           <w:szCs w:val="14"/>
           <w:color w:val="C0392B"/>
         </w:rPr>
-        <w:t xml:space="preserve">DRAFT — produced 2026-07-19 — synthetic data, NOT for regulatory submission</w:t>
+        <w:t xml:space="preserve">DRAFT — produced 2026-09-20 — synthetic data, NOT for regulatory submission</w:t>
       </w:r>
     </w:p>
     <w:p>
@@ -3103,7 +3103,7 @@
           <w:szCs w:val="14"/>
           <w:color w:val="C0392B"/>
         </w:rPr>
-        <w:t xml:space="preserve">DRAFT — produced 2026-07-19 — synthetic data, NOT for regulatory submission</w:t>
+        <w:t xml:space="preserve">DRAFT — produced 2026-09-20 — synthetic data, NOT for regulatory submission</w:t>
       </w:r>
     </w:p>
     <w:p>
@@ -3281,7 +3281,7 @@
           <w:szCs w:val="14"/>
           <w:color w:val="C0392B"/>
         </w:rPr>
-        <w:t xml:space="preserve">DRAFT — produced 2026-07-19 — synthetic data, NOT for regulatory submission</w:t>
+        <w:t xml:space="preserve">DRAFT — produced 2026-09-20 — synthetic data, NOT for regulatory submission</w:t>
       </w:r>
     </w:p>
     <w:p>
@@ -3459,7 +3459,7 @@
           <w:szCs w:val="14"/>
           <w:color w:val="C0392B"/>
         </w:rPr>
-        <w:t xml:space="preserve">DRAFT — produced 2026-07-19 — synthetic data, NOT for regulatory submission</w:t>
+        <w:t xml:space="preserve">DRAFT — produced 2026-09-20 — synthetic data, NOT for regulatory submission</w:t>
       </w:r>
     </w:p>
     <w:p>
@@ -3637,7 +3637,7 @@
           <w:szCs w:val="14"/>
           <w:color w:val="C0392B"/>
         </w:rPr>
-        <w:t xml:space="preserve">DRAFT — produced 2026-07-19 — synthetic data, NOT for regulatory submission</w:t>
+        <w:t xml:space="preserve">DRAFT — produced 2026-09-20 — synthetic data, NOT for regulatory submission</w:t>
       </w:r>
     </w:p>
     <w:p>
@@ -3815,7 +3815,7 @@
           <w:szCs w:val="14"/>
           <w:color w:val="C0392B"/>
         </w:rPr>
-        <w:t xml:space="preserve">DRAFT — produced 2026-07-19 — synthetic data, NOT for regulatory submission</w:t>
+        <w:t xml:space="preserve">DRAFT — produced 2026-09-20 — synthetic data, NOT for regulatory submission</w:t>
       </w:r>
     </w:p>
     <w:p>
@@ -3993,7 +3993,7 @@
           <w:szCs w:val="14"/>
           <w:color w:val="C0392B"/>
         </w:rPr>
-        <w:t xml:space="preserve">DRAFT — produced 2026-07-19 — synthetic data, NOT for regulatory submission</w:t>
+        <w:t xml:space="preserve">DRAFT — produced 2026-09-20 — synthetic data, NOT for regulatory submission</w:t>
       </w:r>
     </w:p>
     <w:p>
@@ -4171,7 +4171,7 @@
           <w:szCs w:val="14"/>
           <w:color w:val="C0392B"/>
         </w:rPr>
-        <w:t xml:space="preserve">DRAFT — produced 2026-07-19 — synthetic data, NOT for regulatory submission</w:t>
+        <w:t xml:space="preserve">DRAFT — produced 2026-09-20 — synthetic data, NOT for regulatory submission</w:t>
       </w:r>
     </w:p>
     <w:p>
@@ -4349,7 +4349,7 @@
           <w:szCs w:val="14"/>
           <w:color w:val="C0392B"/>
         </w:rPr>
-        <w:t xml:space="preserve">DRAFT — produced 2026-07-19 — synthetic data, NOT for regulatory submission</w:t>
+        <w:t xml:space="preserve">DRAFT — produced 2026-09-20 — synthetic data, NOT for regulatory submission</w:t>
       </w:r>
     </w:p>
     <w:p>
@@ -4527,7 +4527,7 @@
           <w:szCs w:val="14"/>
           <w:color w:val="C0392B"/>
         </w:rPr>
-        <w:t xml:space="preserve">DRAFT — produced 2026-07-19 — synthetic data, NOT for regulatory submission</w:t>
+        <w:t xml:space="preserve">DRAFT — produced 2026-09-20 — synthetic data, NOT for regulatory submission</w:t>
       </w:r>
     </w:p>
     <w:p>
@@ -4724,7 +4724,7 @@
           <w:szCs w:val="14"/>
           <w:color w:val="C0392B"/>
         </w:rPr>
-        <w:t xml:space="preserve">DRAFT — produced 2026-07-19 — synthetic data, NOT for regulatory submission</w:t>
+        <w:t xml:space="preserve">DRAFT — produced 2026-09-20 — synthetic data, NOT for regulatory submission</w:t>
       </w:r>
     </w:p>
     <w:p>
@@ -4921,7 +4921,7 @@
           <w:szCs w:val="14"/>
           <w:color w:val="C0392B"/>
         </w:rPr>
-        <w:t xml:space="preserve">DRAFT — produced 2026-07-19 — synthetic data, NOT for regulatory submission</w:t>
+        <w:t xml:space="preserve">DRAFT — produced 2026-09-20 — synthetic data, NOT for regulatory submission</w:t>
       </w:r>
     </w:p>
     <w:p>
@@ -5118,7 +5118,7 @@
           <w:szCs w:val="14"/>
           <w:color w:val="C0392B"/>
         </w:rPr>
-        <w:t xml:space="preserve">DRAFT — produced 2026-07-19 — synthetic data, NOT for regulatory submission</w:t>
+        <w:t xml:space="preserve">DRAFT — produced 2026-09-20 — synthetic data, NOT for regulatory submission</w:t>
       </w:r>
     </w:p>
     <w:p>
@@ -5315,7 +5315,7 @@
           <w:szCs w:val="14"/>
           <w:color w:val="C0392B"/>
         </w:rPr>
-        <w:t xml:space="preserve">DRAFT — produced 2026-07-19 — synthetic data, NOT for regulatory submission</w:t>
+        <w:t xml:space="preserve">DRAFT — produced 2026-09-20 — synthetic data, NOT for regulatory submission</w:t>
       </w:r>
     </w:p>
     <w:p>
@@ -5512,7 +5512,7 @@
           <w:szCs w:val="14"/>
           <w:color w:val="C0392B"/>
         </w:rPr>
-        <w:t xml:space="preserve">DRAFT — produced 2026-07-19 — synthetic data, NOT for regulatory submission</w:t>
+        <w:t xml:space="preserve">DRAFT — produced 2026-09-20 — synthetic data, NOT for regulatory submission</w:t>
       </w:r>
     </w:p>
     <w:p>
@@ -5709,7 +5709,7 @@
           <w:szCs w:val="14"/>
           <w:color w:val="C0392B"/>
         </w:rPr>
-        <w:t xml:space="preserve">DRAFT — produced 2026-07-19 — synthetic data, NOT for regulatory submission</w:t>
+        <w:t xml:space="preserve">DRAFT — produced 2026-09-20 — synthetic data, NOT for regulatory submission</w:t>
       </w:r>
     </w:p>
     <w:p>
@@ -5887,7 +5887,7 @@
           <w:szCs w:val="14"/>
           <w:color w:val="C0392B"/>
         </w:rPr>
-        <w:t xml:space="preserve">DRAFT — produced 2026-07-19 — synthetic data, NOT for regulatory submission</w:t>
+        <w:t xml:space="preserve">DRAFT — produced 2026-09-20 — synthetic data, NOT for regulatory submission</w:t>
       </w:r>
     </w:p>
     <w:p>
@@ -6065,7 +6065,7 @@
           <w:szCs w:val="14"/>
           <w:color w:val="C0392B"/>
         </w:rPr>
-        <w:t xml:space="preserve">DRAFT — produced 2026-07-19 — synthetic data, NOT for regulatory submission</w:t>
+        <w:t xml:space="preserve">DRAFT — produced 2026-09-20 — synthetic data, NOT for regulatory submission</w:t>
       </w:r>
     </w:p>
     <w:p>
@@ -6243,7 +6243,7 @@
           <w:szCs w:val="14"/>
           <w:color w:val="C0392B"/>
         </w:rPr>
-        <w:t xml:space="preserve">DRAFT — produced 2026-07-19 — synthetic data, NOT for regulatory submission</w:t>
+        <w:t xml:space="preserve">DRAFT — produced 2026-09-20 — synthetic data, NOT for regulatory submission</w:t>
       </w:r>
     </w:p>
     <w:p>
@@ -6421,7 +6421,7 @@
           <w:szCs w:val="14"/>
           <w:color w:val="C0392B"/>
         </w:rPr>
-        <w:t xml:space="preserve">DRAFT — produced 2026-07-19 — synthetic data, NOT for regulatory submission</w:t>
+        <w:t xml:space="preserve">DRAFT — produced 2026-09-20 — synthetic data, NOT for regulatory submission</w:t>
       </w:r>
     </w:p>
     <w:p>
@@ -6599,7 +6599,7 @@
           <w:szCs w:val="14"/>
           <w:color w:val="C0392B"/>
         </w:rPr>
-        <w:t xml:space="preserve">DRAFT — produced 2026-07-19 — synthetic data, NOT for regulatory submission</w:t>
+        <w:t xml:space="preserve">DRAFT — produced 2026-09-20 — synthetic data, NOT for regulatory submission</w:t>
       </w:r>
     </w:p>
     <w:p>
@@ -6777,7 +6777,7 @@
           <w:szCs w:val="14"/>
           <w:color w:val="C0392B"/>
         </w:rPr>
-        <w:t xml:space="preserve">DRAFT — produced 2026-07-19 — synthetic data, NOT for regulatory submission</w:t>
+        <w:t xml:space="preserve">DRAFT — produced 2026-09-20 — synthetic data, NOT for regulatory submission</w:t>
       </w:r>
     </w:p>
     <w:p>
@@ -6955,7 +6955,7 @@
           <w:szCs w:val="14"/>
           <w:color w:val="C0392B"/>
         </w:rPr>
-        <w:t xml:space="preserve">DRAFT — produced 2026-07-19 — synthetic data, NOT for regulatory submission</w:t>
+        <w:t xml:space="preserve">DRAFT — produced 2026-09-20 — synthetic data, NOT for regulatory submission</w:t>
       </w:r>
     </w:p>
     <w:p>
@@ -7133,7 +7133,7 @@
           <w:szCs w:val="14"/>
           <w:color w:val="C0392B"/>
         </w:rPr>
-        <w:t xml:space="preserve">DRAFT — produced 2026-07-19 — synthetic data, NOT for regulatory submission</w:t>
+        <w:t xml:space="preserve">DRAFT — produced 2026-09-20 — synthetic data, NOT for regulatory submission</w:t>
       </w:r>
     </w:p>
     <w:p>
@@ -7311,7 +7311,7 @@
           <w:szCs w:val="14"/>
           <w:color w:val="C0392B"/>
         </w:rPr>
-        <w:t xml:space="preserve">DRAFT — produced 2026-07-19 — synthetic data, NOT for regulatory submission</w:t>
+        <w:t xml:space="preserve">DRAFT — produced 2026-09-20 — synthetic data, NOT for regulatory submission</w:t>
       </w:r>
     </w:p>
     <w:p>
@@ -7489,7 +7489,7 @@
           <w:szCs w:val="14"/>
           <w:color w:val="C0392B"/>
         </w:rPr>
-        <w:t xml:space="preserve">DRAFT — produced 2026-07-19 — synthetic data, NOT for regulatory submission</w:t>
+        <w:t xml:space="preserve">DRAFT — produced 2026-09-20 — synthetic data, NOT for regulatory submission</w:t>
       </w:r>
     </w:p>
     <w:p>
@@ -7667,7 +7667,7 @@
           <w:szCs w:val="14"/>
           <w:color w:val="C0392B"/>
         </w:rPr>
-        <w:t xml:space="preserve">DRAFT — produced 2026-07-19 — synthetic data, NOT for regulatory submission</w:t>
+        <w:t xml:space="preserve">DRAFT — produced 2026-09-20 — synthetic data, NOT for regulatory submission</w:t>
       </w:r>
     </w:p>
     <w:p>
@@ -7845,7 +7845,7 @@
           <w:szCs w:val="14"/>
           <w:color w:val="C0392B"/>
         </w:rPr>
-        <w:t xml:space="preserve">DRAFT — produced 2026-07-19 — synthetic data, NOT for regulatory submission</w:t>
+        <w:t xml:space="preserve">DRAFT — produced 2026-09-20 — synthetic data, NOT for regulatory submission</w:t>
       </w:r>
     </w:p>
     <w:p>
@@ -8023,7 +8023,7 @@
           <w:szCs w:val="14"/>
           <w:color w:val="C0392B"/>
         </w:rPr>
-        <w:t xml:space="preserve">DRAFT — produced 2026-07-19 — synthetic data, NOT for regulatory submission</w:t>
+        <w:t xml:space="preserve">DRAFT — produced 2026-09-20 — synthetic data, NOT for regulatory submission</w:t>
       </w:r>
     </w:p>
     <w:p>
@@ -8201,7 +8201,7 @@
           <w:szCs w:val="14"/>
           <w:color w:val="C0392B"/>
         </w:rPr>
-        <w:t xml:space="preserve">DRAFT — produced 2026-07-19 — synthetic data, NOT for regulatory submission</w:t>
+        <w:t xml:space="preserve">DRAFT — produced 2026-09-20 — synthetic data, NOT for regulatory submission</w:t>
       </w:r>
     </w:p>
     <w:p>
@@ -8379,7 +8379,7 @@
           <w:szCs w:val="14"/>
           <w:color w:val="C0392B"/>
         </w:rPr>
-        <w:t xml:space="preserve">DRAFT — produced 2026-07-19 — synthetic data, NOT for regulatory submission</w:t>
+        <w:t xml:space="preserve">DRAFT — produced 2026-09-20 — synthetic data, NOT for regulatory submission</w:t>
       </w:r>
     </w:p>
     <w:p>
@@ -8557,7 +8557,7 @@
           <w:szCs w:val="14"/>
           <w:color w:val="C0392B"/>
         </w:rPr>
-        <w:t xml:space="preserve">DRAFT — produced 2026-07-19 — synthetic data, NOT for regulatory submission</w:t>
+        <w:t xml:space="preserve">DRAFT — produced 2026-09-20 — synthetic data, NOT for regulatory submission</w:t>
       </w:r>
     </w:p>
     <w:p>
@@ -8735,7 +8735,7 @@
           <w:szCs w:val="14"/>
           <w:color w:val="C0392B"/>
         </w:rPr>
-        <w:t xml:space="preserve">DRAFT — produced 2026-07-19 — synthetic data, NOT for regulatory submission</w:t>
+        <w:t xml:space="preserve">DRAFT — produced 2026-09-20 — synthetic data, NOT for regulatory submission</w:t>
       </w:r>
     </w:p>
     <w:p>
@@ -8913,7 +8913,7 @@
           <w:szCs w:val="14"/>
           <w:color w:val="C0392B"/>
         </w:rPr>
-        <w:t xml:space="preserve">DRAFT — produced 2026-07-19 — synthetic data, NOT for regulatory submission</w:t>
+        <w:t xml:space="preserve">DRAFT — produced 2026-09-20 — synthetic data, NOT for regulatory submission</w:t>
       </w:r>
     </w:p>
     <w:p>
@@ -9091,7 +9091,7 @@
           <w:szCs w:val="14"/>
           <w:color w:val="C0392B"/>
         </w:rPr>
-        <w:t xml:space="preserve">DRAFT — produced 2026-07-19 — synthetic data, NOT for regulatory submission</w:t>
+        <w:t xml:space="preserve">DRAFT — produced 2026-09-20 — synthetic data, NOT for regulatory submission</w:t>
       </w:r>
     </w:p>
     <w:sectPr>

</xml_diff>